<commit_message>
Se agregan los mockups
</commit_message>
<xml_diff>
--- a/Gestión/Registro de definición e identificación del proyecto.docx
+++ b/Gestión/Registro de definición e identificación del proyecto.docx
@@ -1417,12 +1417,12 @@
                 <wp:inline distB="0" distT="0" distL="0" distR="0">
                   <wp:extent cx="432019" cy="432019"/>
                   <wp:effectExtent b="0" l="0" r="0" t="0"/>
-                  <wp:docPr descr="Inteligencia artificial con relleno sólido" id="2106009980" name="image4.png"/>
+                  <wp:docPr descr="Inteligencia artificial con relleno sólido" id="2106009980" name="image5.png"/>
                   <a:graphic>
                     <a:graphicData uri="http://schemas.openxmlformats.org/drawingml/2006/picture">
                       <pic:pic>
                         <pic:nvPicPr>
-                          <pic:cNvPr descr="Inteligencia artificial con relleno sólido" id="0" name="image4.png"/>
+                          <pic:cNvPr descr="Inteligencia artificial con relleno sólido" id="0" name="image5.png"/>
                           <pic:cNvPicPr preferRelativeResize="0"/>
                         </pic:nvPicPr>
                         <pic:blipFill>
@@ -3606,7 +3606,7 @@
                 <w:szCs w:val="20"/>
                 <w:rtl w:val="0"/>
               </w:rPr>
-              <w:t xml:space="preserve"> La Constructora Pitágora S.A. cuenta con más de 20 años de experiencia ejecutando obras de gran envergadura (hasta 858.000 UF) para clientes de alto perfil como Komatsu y la UC. Actualmente, por ley, deben responder a garantías de hasta 10 años en estructura. La falta de un acta de recepción digital y el uso de canales informales como WhatsApp los ha llevado a enfrentar juicios complejos donde debieron imprimir cientos de correos para demostrar la atención prestada. Por ello, la motivación principal es profesionalizar el servicio, garantizando la trazabilidad legal y optimizando la experiencia del cliente para asegurar la continuidad comercial.</w:t>
+              <w:t xml:space="preserve"> La Constructora Pitágora S.A. Cuenta con más de 20 años de experiencia ejecutando obras de gran envergadura (hasta 858.000 UF) para clientes de alto perfil como Komatsu y la UC. Actualmente, por ley, deben responder a garantías de hasta 10 años en estructura. La falta de un acta de recepción digital y el uso de canales informales como WhatsApp los ha llevado a enfrentar juicios complejos donde debieron imprimir cientos de correos para demostrar la atención prestada. Por ello, la motivación principal es profesionalizar el servicio, garantizando la trazabilidad legal y optimizando la experiencia del cliente para asegurar la continuidad comercial.</w:t>
             </w:r>
             <w:r>
               <w:rPr>
@@ -3801,7 +3801,7 @@
           <w:sdt>
             <w:sdtPr>
               <w:lock w:val="contentLocked"/>
-              <w:id w:val="-416810414"/>
+              <w:id w:val="183881136"/>
               <w:tag w:val="goog_rdk_0"/>
             </w:sdtPr>
             <w:sdtContent>
@@ -5381,7 +5381,7 @@
           <w:sdt>
             <w:sdtPr>
               <w:lock w:val="contentLocked"/>
-              <w:id w:val="-1962879088"/>
+              <w:id w:val="-403010528"/>
               <w:tag w:val="goog_rdk_1"/>
             </w:sdtPr>
             <w:sdtContent>
@@ -7555,7 +7555,7 @@
           <w:sdt>
             <w:sdtPr>
               <w:lock w:val="contentLocked"/>
-              <w:id w:val="-1940660180"/>
+              <w:id w:val="1668818589"/>
               <w:tag w:val="goog_rdk_2"/>
             </w:sdtPr>
             <w:sdtContent>
@@ -8001,19 +8001,6 @@
                           <w:szCs w:val="20"/>
                         </w:rPr>
                       </w:pPr>
-                      <w:hyperlink r:id="rId13">
-                        <w:r>
-                          <w:rPr>
-                            <w:rFonts w:ascii="Calibri" w:cs="Calibri" w:eastAsia="Calibri" w:hAnsi="Calibri"/>
-                            <w:color w:val="1155cc"/>
-                            <w:sz w:val="20"/>
-                            <w:szCs w:val="20"/>
-                            <w:u w:val="single"/>
-                            <w:rtl w:val="0"/>
-                          </w:rPr>
-                          <w:t xml:space="preserve">Node.js</w:t>
-                        </w:r>
-                      </w:hyperlink>
                       <w:r>
                         <w:rPr>
                           <w:rFonts w:ascii="Calibri" w:cs="Calibri" w:eastAsia="Calibri" w:hAnsi="Calibri"/>
@@ -8021,7 +8008,7 @@
                           <w:szCs w:val="20"/>
                           <w:rtl w:val="0"/>
                         </w:rPr>
-                        <w:t xml:space="preserve"> + express</w:t>
+                        <w:t xml:space="preserve">Java - SpringBoot</w:t>
                       </w:r>
                     </w:p>
                   </w:tc>
@@ -8066,7 +8053,7 @@
                           <w:szCs w:val="20"/>
                           <w:rtl w:val="0"/>
                         </w:rPr>
-                        <w:t xml:space="preserve">Permite un desarrollo ágil y una integración nativa con los servicios de Firebase y APIs de Google. Ideal para manejar notificaciones en tiempo real.</w:t>
+                        <w:t xml:space="preserve">Simplifica el desarrollo en Java mediante la autoconfiguración. Permite a los desarrolladores crear APIs y microservicios de forma rápida y escalable. </w:t>
                       </w:r>
                     </w:p>
                   </w:tc>
@@ -10028,28 +10015,7 @@
                 <w:szCs w:val="20"/>
                 <w:rtl w:val="0"/>
               </w:rPr>
-              <w:t xml:space="preserve">PC, internet, MySql workbench, </w:t>
-            </w:r>
-            <w:hyperlink r:id="rId14">
-              <w:r>
-                <w:rPr>
-                  <w:rFonts w:ascii="Calibri" w:cs="Calibri" w:eastAsia="Calibri" w:hAnsi="Calibri"/>
-                  <w:sz w:val="20"/>
-                  <w:szCs w:val="20"/>
-                  <w:u w:val="single"/>
-                  <w:rtl w:val="0"/>
-                </w:rPr>
-                <w:t xml:space="preserve">Node.js</w:t>
-              </w:r>
-            </w:hyperlink>
-            <w:r>
-              <w:rPr>
-                <w:rFonts w:ascii="Calibri" w:cs="Calibri" w:eastAsia="Calibri" w:hAnsi="Calibri"/>
-                <w:sz w:val="20"/>
-                <w:szCs w:val="20"/>
-                <w:rtl w:val="0"/>
-              </w:rPr>
-              <w:t xml:space="preserve">, Cloud SQL.</w:t>
+              <w:t xml:space="preserve">PC, internet, MySql workbench, Cloud SQL.</w:t>
             </w:r>
           </w:p>
         </w:tc>
@@ -10539,7 +10505,7 @@
                 <w:szCs w:val="20"/>
                 <w:rtl w:val="0"/>
               </w:rPr>
-              <w:t xml:space="preserve">PC, internet, Cloud Storage, Nodemailer/SendGrid, React.</w:t>
+              <w:t xml:space="preserve">PC, internet, Cloud Storage, API Gmail, React.</w:t>
             </w:r>
           </w:p>
         </w:tc>
@@ -10784,29 +10750,7 @@
                 <w:szCs w:val="20"/>
                 <w:rtl w:val="0"/>
               </w:rPr>
-              <w:t xml:space="preserve">PC, internet, </w:t>
-            </w:r>
-            <w:hyperlink r:id="rId15">
-              <w:r>
-                <w:rPr>
-                  <w:rFonts w:ascii="Calibri" w:cs="Calibri" w:eastAsia="Calibri" w:hAnsi="Calibri"/>
-                  <w:color w:val="1155cc"/>
-                  <w:sz w:val="20"/>
-                  <w:szCs w:val="20"/>
-                  <w:u w:val="single"/>
-                  <w:rtl w:val="0"/>
-                </w:rPr>
-                <w:t xml:space="preserve">node.js</w:t>
-              </w:r>
-            </w:hyperlink>
-            <w:r>
-              <w:rPr>
-                <w:rFonts w:ascii="Calibri" w:cs="Calibri" w:eastAsia="Calibri" w:hAnsi="Calibri"/>
-                <w:sz w:val="20"/>
-                <w:szCs w:val="20"/>
-                <w:rtl w:val="0"/>
-              </w:rPr>
-              <w:t xml:space="preserve">, MySQL.</w:t>
+              <w:t xml:space="preserve">PC, internet, Springboot, MySQL.</w:t>
             </w:r>
           </w:p>
         </w:tc>
@@ -11298,7 +11242,7 @@
               </w:rPr>
               <w:t xml:space="preserve">PC, internet, SQL, </w:t>
             </w:r>
-            <w:hyperlink r:id="rId16">
+            <w:hyperlink r:id="rId13">
               <w:r>
                 <w:rPr>
                   <w:rFonts w:ascii="Calibri" w:cs="Calibri" w:eastAsia="Calibri" w:hAnsi="Calibri"/>
@@ -11563,29 +11507,7 @@
                 <w:szCs w:val="20"/>
                 <w:rtl w:val="0"/>
               </w:rPr>
-              <w:t xml:space="preserve">Pc, internet, Python/</w:t>
-            </w:r>
-            <w:hyperlink r:id="rId17">
-              <w:r>
-                <w:rPr>
-                  <w:rFonts w:ascii="Calibri" w:cs="Calibri" w:eastAsia="Calibri" w:hAnsi="Calibri"/>
-                  <w:color w:val="1155cc"/>
-                  <w:sz w:val="20"/>
-                  <w:szCs w:val="20"/>
-                  <w:u w:val="single"/>
-                  <w:rtl w:val="0"/>
-                </w:rPr>
-                <w:t xml:space="preserve">Node.js</w:t>
-              </w:r>
-            </w:hyperlink>
-            <w:r>
-              <w:rPr>
-                <w:rFonts w:ascii="Calibri" w:cs="Calibri" w:eastAsia="Calibri" w:hAnsi="Calibri"/>
-                <w:sz w:val="20"/>
-                <w:szCs w:val="20"/>
-                <w:rtl w:val="0"/>
-              </w:rPr>
-              <w:t xml:space="preserve">, API IA (OpenAI/Vertex).</w:t>
+              <w:t xml:space="preserve">Pc, internet,  API IA (OpenAI/Vertex).</w:t>
             </w:r>
           </w:p>
         </w:tc>
@@ -13054,7 +12976,7 @@
                 <w:szCs w:val="22"/>
               </w:rPr>
             </w:pPr>
-            <w:hyperlink r:id="rId18">
+            <w:hyperlink r:id="rId14">
               <w:r>
                 <w:rPr>
                   <w:rFonts w:ascii="Calibri" w:cs="Calibri" w:eastAsia="Calibri" w:hAnsi="Calibri"/>
@@ -13282,7 +13204,7 @@
                 <w:szCs w:val="22"/>
               </w:rPr>
             </w:pPr>
-            <w:hyperlink r:id="rId19">
+            <w:hyperlink r:id="rId15">
               <w:r>
                 <w:rPr>
                   <w:rFonts w:ascii="Calibri" w:cs="Calibri" w:eastAsia="Calibri" w:hAnsi="Calibri"/>
@@ -13490,7 +13412,7 @@
                 <w:szCs w:val="22"/>
               </w:rPr>
             </w:pPr>
-            <w:hyperlink r:id="rId20">
+            <w:hyperlink r:id="rId16">
               <w:r>
                 <w:rPr>
                   <w:rFonts w:ascii="Calibri" w:cs="Calibri" w:eastAsia="Calibri" w:hAnsi="Calibri"/>
@@ -13698,7 +13620,7 @@
                 <w:szCs w:val="22"/>
               </w:rPr>
             </w:pPr>
-            <w:hyperlink r:id="rId21">
+            <w:hyperlink r:id="rId17">
               <w:r>
                 <w:rPr>
                   <w:rFonts w:ascii="Calibri" w:cs="Calibri" w:eastAsia="Calibri" w:hAnsi="Calibri"/>
@@ -13899,7 +13821,7 @@
                 <w:szCs w:val="22"/>
               </w:rPr>
             </w:pPr>
-            <w:hyperlink r:id="rId22">
+            <w:hyperlink r:id="rId18">
               <w:r>
                 <w:rPr>
                   <w:rFonts w:ascii="Calibri" w:cs="Calibri" w:eastAsia="Calibri" w:hAnsi="Calibri"/>
@@ -15162,7 +15084,7 @@
     <w:sdt>
       <w:sdtPr>
         <w:lock w:val="contentLocked"/>
-        <w:id w:val="291438578"/>
+        <w:id w:val="1808359267"/>
         <w:tag w:val="goog_rdk_3"/>
       </w:sdtPr>
       <w:sdtContent>
@@ -16912,8 +16834,8 @@
       </w:r>
     </w:p>
     <w:sectPr>
-      <w:headerReference r:id="rId23" w:type="default"/>
-      <w:footerReference r:id="rId24" w:type="default"/>
+      <w:headerReference r:id="rId19" w:type="default"/>
+      <w:footerReference r:id="rId20" w:type="default"/>
       <w:pgSz w:h="18720" w:w="12240" w:orient="portrait"/>
       <w:pgMar w:bottom="1417" w:top="1417" w:left="1701" w:right="1701" w:header="708" w:footer="1202"/>
       <w:pgNumType w:start="1"/>
@@ -17204,12 +17126,12 @@
         <wp:inline distB="0" distT="0" distL="0" distR="0">
           <wp:extent cx="1869144" cy="498662"/>
           <wp:effectExtent b="0" l="0" r="0" t="0"/>
-          <wp:docPr descr="Texto&#10;&#10;Descripción generada automáticamente con confianza media" id="2106009982" name="image5.jpg"/>
+          <wp:docPr descr="Texto&#10;&#10;Descripción generada automáticamente con confianza media" id="2106009982" name="image4.jpg"/>
           <a:graphic>
             <a:graphicData uri="http://schemas.openxmlformats.org/drawingml/2006/picture">
               <pic:pic>
                 <pic:nvPicPr>
-                  <pic:cNvPr descr="Texto&#10;&#10;Descripción generada automáticamente con confianza media" id="0" name="image5.jpg"/>
+                  <pic:cNvPr descr="Texto&#10;&#10;Descripción generada automáticamente con confianza media" id="0" name="image4.jpg"/>
                   <pic:cNvPicPr preferRelativeResize="0"/>
                 </pic:nvPicPr>
                 <pic:blipFill>

</xml_diff>